<commit_message>
docs: adjust documents variables template
</commit_message>
<xml_diff>
--- a/src/templates/documents/contrato_honorario_advocaticios.docx
+++ b/src/templates/documents/contrato_honorario_advocaticios.docx
@@ -141,7 +141,7 @@
         <w:rPr>
           <w:w w:val="105"/>
         </w:rPr>
-        <w:t>{{civil_status}}</w:t>
+        <w:t>{{civilstatus}}</w:t>
       </w:r>
       <w:r>
         <w:rPr>
@@ -195,7 +195,7 @@
         <w:t xml:space="preserve">, CEP: </w:t>
       </w:r>
       <w:r>
-        <w:t>{{postal_code}}</w:t>
+        <w:t>{{postalcode}}</w:t>
       </w:r>
       <w:r>
         <w:t xml:space="preserve">, Telefone: </w:t>
@@ -284,7 +284,7 @@
           </mc:Choice>
           <mc:Fallback>
             <w:pict>
-              <v:shape w14:anchorId="69CC5748" id="Graphic 2" o:spid="_x0000_s1026" style="position:absolute;margin-left:31pt;margin-top:10.6pt;width:533pt;height:.1pt;z-index:-15728640;visibility:visible;mso-wrap-style:square;mso-wrap-distance-left:0;mso-wrap-distance-top:0;mso-wrap-distance-right:0;mso-wrap-distance-bottom:0;mso-position-horizontal:absolute;mso-position-horizontal-relative:page;mso-position-vertical:absolute;mso-position-vertical-relative:text;v-text-anchor:top" coordsize="6769100,1270" o:gfxdata="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" path="m,l6769099,e" filled="f" strokecolor="#878787" strokeweight="1pt">
+              <v:shape w14:anchorId="49FDBF07" id="Graphic 2" o:spid="_x0000_s1026" style="position:absolute;margin-left:31pt;margin-top:10.6pt;width:533pt;height:.1pt;z-index:-15728640;visibility:visible;mso-wrap-style:square;mso-wrap-distance-left:0;mso-wrap-distance-top:0;mso-wrap-distance-right:0;mso-wrap-distance-bottom:0;mso-position-horizontal:absolute;mso-position-horizontal-relative:page;mso-position-vertical:absolute;mso-position-vertical-relative:text;v-text-anchor:top" coordsize="6769100,1270" o:gfxdata="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" path="m,l6769099,e" filled="f" strokecolor="#878787" strokeweight="1pt">
                 <v:path arrowok="t"/>
                 <w10:wrap type="topAndBottom" anchorx="page"/>
               </v:shape>
@@ -774,7 +774,7 @@
           </mc:Choice>
           <mc:Fallback>
             <w:pict>
-              <v:shape w14:anchorId="37D98D60" id="Graphic 3" o:spid="_x0000_s1026" style="position:absolute;margin-left:31pt;margin-top:11.9pt;width:533pt;height:.1pt;z-index:-15728128;visibility:visible;mso-wrap-style:square;mso-wrap-distance-left:0;mso-wrap-distance-top:0;mso-wrap-distance-right:0;mso-wrap-distance-bottom:0;mso-position-horizontal:absolute;mso-position-horizontal-relative:page;mso-position-vertical:absolute;mso-position-vertical-relative:text;v-text-anchor:top" coordsize="6769100,1270" o:gfxdata="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" path="m,l6769099,e" filled="f" strokecolor="#878787" strokeweight="1pt">
+              <v:shape w14:anchorId="3ED9D253" id="Graphic 3" o:spid="_x0000_s1026" style="position:absolute;margin-left:31pt;margin-top:11.9pt;width:533pt;height:.1pt;z-index:-15728128;visibility:visible;mso-wrap-style:square;mso-wrap-distance-left:0;mso-wrap-distance-top:0;mso-wrap-distance-right:0;mso-wrap-distance-bottom:0;mso-position-horizontal:absolute;mso-position-horizontal-relative:page;mso-position-vertical:absolute;mso-position-vertical-relative:text;v-text-anchor:top" coordsize="6769100,1270" o:gfxdata="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" path="m,l6769099,e" filled="f" strokecolor="#878787" strokeweight="1pt">
                 <v:path arrowok="t"/>
                 <w10:wrap type="topAndBottom" anchorx="page"/>
               </v:shape>
@@ -3792,7 +3792,13 @@
         <w:t xml:space="preserve"> </w:t>
       </w:r>
       <w:r>
-        <w:t>{{date_now}}</w:t>
+        <w:t>{{</w:t>
+      </w:r>
+      <w:r>
+        <w:t>date</w:t>
+      </w:r>
+      <w:r>
+        <w:t>}}</w:t>
       </w:r>
       <w:r>
         <w:rPr>

</xml_diff>

<commit_message>
dosc: adjust layout and doc fomat
</commit_message>
<xml_diff>
--- a/src/templates/documents/contrato_honorario_advocaticios.docx
+++ b/src/templates/documents/contrato_honorario_advocaticios.docx
@@ -121,15 +121,33 @@
           <w:b/>
           <w:w w:val="105"/>
         </w:rPr>
-        <w:t>{{name}}</w:t>
-      </w:r>
-      <w:r>
-        <w:rPr>
-          <w:rFonts w:ascii="Palatino Linotype" w:hAnsi="Palatino Linotype"/>
-          <w:b/>
-          <w:w w:val="105"/>
-        </w:rPr>
-        <w:t xml:space="preserve"> , </w:t>
+        <w:t>{{</w:t>
+      </w:r>
+      <w:proofErr w:type="spellStart"/>
+      <w:r>
+        <w:rPr>
+          <w:rFonts w:ascii="Palatino Linotype" w:hAnsi="Palatino Linotype"/>
+          <w:b/>
+          <w:w w:val="105"/>
+        </w:rPr>
+        <w:t>name</w:t>
+      </w:r>
+      <w:proofErr w:type="spellEnd"/>
+      <w:r>
+        <w:rPr>
+          <w:rFonts w:ascii="Palatino Linotype" w:hAnsi="Palatino Linotype"/>
+          <w:b/>
+          <w:w w:val="105"/>
+        </w:rPr>
+        <w:t>}}</w:t>
+      </w:r>
+      <w:r>
+        <w:rPr>
+          <w:rFonts w:ascii="Palatino Linotype" w:hAnsi="Palatino Linotype"/>
+          <w:b/>
+          <w:w w:val="105"/>
+        </w:rPr>
+        <w:t xml:space="preserve">, </w:t>
       </w:r>
       <w:r>
         <w:rPr>
@@ -141,7 +159,21 @@
         <w:rPr>
           <w:w w:val="105"/>
         </w:rPr>
-        <w:t>{{civilstatus}}</w:t>
+        <w:t>{{</w:t>
+      </w:r>
+      <w:proofErr w:type="spellStart"/>
+      <w:r>
+        <w:rPr>
+          <w:w w:val="105"/>
+        </w:rPr>
+        <w:t>civilstatus</w:t>
+      </w:r>
+      <w:proofErr w:type="spellEnd"/>
+      <w:r>
+        <w:rPr>
+          <w:w w:val="105"/>
+        </w:rPr>
+        <w:t>}}</w:t>
       </w:r>
       <w:r>
         <w:rPr>
@@ -153,7 +185,21 @@
         <w:rPr>
           <w:w w:val="105"/>
         </w:rPr>
-        <w:t>{{identification}}</w:t>
+        <w:t>{{</w:t>
+      </w:r>
+      <w:proofErr w:type="spellStart"/>
+      <w:r>
+        <w:rPr>
+          <w:w w:val="105"/>
+        </w:rPr>
+        <w:t>identification</w:t>
+      </w:r>
+      <w:proofErr w:type="spellEnd"/>
+      <w:r>
+        <w:rPr>
+          <w:w w:val="105"/>
+        </w:rPr>
+        <w:t>}}</w:t>
       </w:r>
       <w:r>
         <w:rPr>
@@ -177,7 +223,21 @@
         <w:rPr>
           <w:w w:val="105"/>
         </w:rPr>
-        <w:t>{{city}}</w:t>
+        <w:t>{{</w:t>
+      </w:r>
+      <w:proofErr w:type="spellStart"/>
+      <w:r>
+        <w:rPr>
+          <w:w w:val="105"/>
+        </w:rPr>
+        <w:t>city</w:t>
+      </w:r>
+      <w:proofErr w:type="spellEnd"/>
+      <w:r>
+        <w:rPr>
+          <w:w w:val="105"/>
+        </w:rPr>
+        <w:t>}}</w:t>
       </w:r>
       <w:r>
         <w:rPr>
@@ -189,19 +249,43 @@
         <w:t xml:space="preserve">Estado de </w:t>
       </w:r>
       <w:r>
-        <w:t>{{state}}</w:t>
+        <w:t>{{</w:t>
+      </w:r>
+      <w:proofErr w:type="spellStart"/>
+      <w:r>
+        <w:t>state</w:t>
+      </w:r>
+      <w:proofErr w:type="spellEnd"/>
+      <w:r>
+        <w:t>}}</w:t>
       </w:r>
       <w:r>
         <w:t xml:space="preserve">, CEP: </w:t>
       </w:r>
       <w:r>
-        <w:t>{{postalcode}}</w:t>
+        <w:t>{{</w:t>
+      </w:r>
+      <w:proofErr w:type="spellStart"/>
+      <w:r>
+        <w:t>postalcode</w:t>
+      </w:r>
+      <w:proofErr w:type="spellEnd"/>
+      <w:r>
+        <w:t>}}</w:t>
       </w:r>
       <w:r>
         <w:t xml:space="preserve">, Telefone: </w:t>
       </w:r>
       <w:r>
-        <w:t>{{cellphone}}</w:t>
+        <w:t>{{</w:t>
+      </w:r>
+      <w:proofErr w:type="spellStart"/>
+      <w:r>
+        <w:t>cellphone</w:t>
+      </w:r>
+      <w:proofErr w:type="spellEnd"/>
+      <w:r>
+        <w:t>}}</w:t>
       </w:r>
     </w:p>
     <w:p>
@@ -284,7 +368,7 @@
           </mc:Choice>
           <mc:Fallback>
             <w:pict>
-              <v:shape w14:anchorId="49FDBF07" id="Graphic 2" o:spid="_x0000_s1026" style="position:absolute;margin-left:31pt;margin-top:10.6pt;width:533pt;height:.1pt;z-index:-15728640;visibility:visible;mso-wrap-style:square;mso-wrap-distance-left:0;mso-wrap-distance-top:0;mso-wrap-distance-right:0;mso-wrap-distance-bottom:0;mso-position-horizontal:absolute;mso-position-horizontal-relative:page;mso-position-vertical:absolute;mso-position-vertical-relative:text;v-text-anchor:top" coordsize="6769100,1270" o:gfxdata="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" path="m,l6769099,e" filled="f" strokecolor="#878787" strokeweight="1pt">
+              <v:shape w14:anchorId="4920B4A7" id="Graphic 2" o:spid="_x0000_s1026" style="position:absolute;margin-left:31pt;margin-top:10.6pt;width:533pt;height:.1pt;z-index:-15728640;visibility:visible;mso-wrap-style:square;mso-wrap-distance-left:0;mso-wrap-distance-top:0;mso-wrap-distance-right:0;mso-wrap-distance-bottom:0;mso-position-horizontal:absolute;mso-position-horizontal-relative:page;mso-position-vertical:absolute;mso-position-vertical-relative:text;v-text-anchor:top" coordsize="6769100,1270" o:gfxdata="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" path="m,l6769099,e" filled="f" strokecolor="#878787" strokeweight="1pt">
                 <v:path arrowok="t"/>
                 <w10:wrap type="topAndBottom" anchorx="page"/>
               </v:shape>
@@ -774,7 +858,7 @@
           </mc:Choice>
           <mc:Fallback>
             <w:pict>
-              <v:shape w14:anchorId="3ED9D253" id="Graphic 3" o:spid="_x0000_s1026" style="position:absolute;margin-left:31pt;margin-top:11.9pt;width:533pt;height:.1pt;z-index:-15728128;visibility:visible;mso-wrap-style:square;mso-wrap-distance-left:0;mso-wrap-distance-top:0;mso-wrap-distance-right:0;mso-wrap-distance-bottom:0;mso-position-horizontal:absolute;mso-position-horizontal-relative:page;mso-position-vertical:absolute;mso-position-vertical-relative:text;v-text-anchor:top" coordsize="6769100,1270" o:gfxdata="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" path="m,l6769099,e" filled="f" strokecolor="#878787" strokeweight="1pt">
+              <v:shape w14:anchorId="235B5342" id="Graphic 3" o:spid="_x0000_s1026" style="position:absolute;margin-left:31pt;margin-top:11.9pt;width:533pt;height:.1pt;z-index:-15728128;visibility:visible;mso-wrap-style:square;mso-wrap-distance-left:0;mso-wrap-distance-top:0;mso-wrap-distance-right:0;mso-wrap-distance-bottom:0;mso-position-horizontal:absolute;mso-position-horizontal-relative:page;mso-position-vertical:absolute;mso-position-vertical-relative:text;v-text-anchor:top" coordsize="6769100,1270" o:gfxdata="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" path="m,l6769099,e" filled="f" strokecolor="#878787" strokeweight="1pt">
                 <v:path arrowok="t"/>
                 <w10:wrap type="topAndBottom" anchorx="page"/>
               </v:shape>
@@ -1035,13 +1119,29 @@
           <w:b/>
           <w:w w:val="105"/>
         </w:rPr>
-        <w:t xml:space="preserve">Parágrafo Único </w:t>
-      </w:r>
-      <w:r>
-        <w:rPr>
-          <w:w w:val="105"/>
-        </w:rPr>
-        <w:t>As partes se obrigam a manter o mais absoluto sigilo com relação a toda e qualquer informação e/ ou documentação, que a partir desta data, fornecida para o andamento do processo, devendo ser tratada como sigilosa.</w:t>
+        <w:t xml:space="preserve">Parágrafo </w:t>
+      </w:r>
+      <w:proofErr w:type="gramStart"/>
+      <w:r>
+        <w:rPr>
+          <w:rFonts w:ascii="Palatino Linotype" w:hAnsi="Palatino Linotype"/>
+          <w:b/>
+          <w:w w:val="105"/>
+        </w:rPr>
+        <w:t xml:space="preserve">Único </w:t>
+      </w:r>
+      <w:r>
+        <w:rPr>
+          <w:w w:val="105"/>
+        </w:rPr>
+        <w:t>As</w:t>
+      </w:r>
+      <w:proofErr w:type="gramEnd"/>
+      <w:r>
+        <w:rPr>
+          <w:w w:val="105"/>
+        </w:rPr>
+        <w:t xml:space="preserve"> partes se obrigam a manter o mais absoluto sigilo com relação a toda e qualquer informação e/ ou documentação, que a partir desta data, fornecida para o andamento do processo, devendo ser tratada como sigilosa.</w:t>
       </w:r>
     </w:p>
     <w:p>
@@ -1053,6 +1153,7 @@
           <w:sz w:val="26"/>
         </w:rPr>
       </w:pPr>
+      <w:proofErr w:type="gramStart"/>
       <w:r>
         <w:rPr>
           <w:rFonts w:ascii="Palatino Linotype" w:hAnsi="Palatino Linotype"/>
@@ -1076,7 +1177,16 @@
           <w:b/>
           <w:sz w:val="26"/>
         </w:rPr>
-        <w:t>SEGUNDA-</w:t>
+        <w:t>SEGUNDA</w:t>
+      </w:r>
+      <w:proofErr w:type="gramEnd"/>
+      <w:r>
+        <w:rPr>
+          <w:rFonts w:ascii="Palatino Linotype" w:hAnsi="Palatino Linotype"/>
+          <w:b/>
+          <w:sz w:val="26"/>
+        </w:rPr>
+        <w:t>-</w:t>
       </w:r>
       <w:r>
         <w:rPr>
@@ -1344,12 +1454,21 @@
         </w:rPr>
         <w:t xml:space="preserve"> </w:t>
       </w:r>
-      <w:r>
-        <w:rPr>
-          <w:w w:val="105"/>
-          <w:sz w:val="26"/>
-        </w:rPr>
-        <w:t>art.</w:t>
+      <w:proofErr w:type="spellStart"/>
+      <w:r>
+        <w:rPr>
+          <w:w w:val="105"/>
+          <w:sz w:val="26"/>
+        </w:rPr>
+        <w:t>art</w:t>
+      </w:r>
+      <w:proofErr w:type="spellEnd"/>
+      <w:r>
+        <w:rPr>
+          <w:w w:val="105"/>
+          <w:sz w:val="26"/>
+        </w:rPr>
+        <w:t>.</w:t>
       </w:r>
       <w:r>
         <w:rPr>
@@ -1982,11 +2101,19 @@
         </w:rPr>
         <w:t xml:space="preserve"> </w:t>
       </w:r>
-      <w:r>
-        <w:rPr>
-          <w:sz w:val="26"/>
-        </w:rPr>
-        <w:t>advocatícia,</w:t>
+      <w:proofErr w:type="spellStart"/>
+      <w:r>
+        <w:rPr>
+          <w:sz w:val="26"/>
+        </w:rPr>
+        <w:t>advocatícia</w:t>
+      </w:r>
+      <w:proofErr w:type="spellEnd"/>
+      <w:r>
+        <w:rPr>
+          <w:sz w:val="26"/>
+        </w:rPr>
+        <w:t>,</w:t>
       </w:r>
       <w:r>
         <w:rPr>
@@ -2099,24 +2226,46 @@
         </w:rPr>
         <w:t xml:space="preserve"> </w:t>
       </w:r>
-      <w:r>
-        <w:rPr>
-          <w:sz w:val="26"/>
-        </w:rPr>
-        <w:t>art.</w:t>
-      </w:r>
-      <w:r>
-        <w:rPr>
-          <w:spacing w:val="40"/>
-          <w:sz w:val="26"/>
-        </w:rPr>
-        <w:t xml:space="preserve"> </w:t>
-      </w:r>
-      <w:r>
-        <w:rPr>
-          <w:sz w:val="26"/>
-        </w:rPr>
-        <w:t>22 da Lei nº 8.906/94 e em conformidade com o art. 133 da Constituição Federal.</w:t>
+      <w:proofErr w:type="spellStart"/>
+      <w:r>
+        <w:rPr>
+          <w:sz w:val="26"/>
+        </w:rPr>
+        <w:t>art</w:t>
+      </w:r>
+      <w:proofErr w:type="spellEnd"/>
+      <w:r>
+        <w:rPr>
+          <w:sz w:val="26"/>
+        </w:rPr>
+        <w:t>.</w:t>
+      </w:r>
+      <w:r>
+        <w:rPr>
+          <w:spacing w:val="40"/>
+          <w:sz w:val="26"/>
+        </w:rPr>
+        <w:t xml:space="preserve"> </w:t>
+      </w:r>
+      <w:r>
+        <w:rPr>
+          <w:sz w:val="26"/>
+        </w:rPr>
+        <w:t xml:space="preserve">22 da Lei nº 8.906/94 e em conformidade com o </w:t>
+      </w:r>
+      <w:proofErr w:type="spellStart"/>
+      <w:r>
+        <w:rPr>
+          <w:sz w:val="26"/>
+        </w:rPr>
+        <w:t>art</w:t>
+      </w:r>
+      <w:proofErr w:type="spellEnd"/>
+      <w:r>
+        <w:rPr>
+          <w:sz w:val="26"/>
+        </w:rPr>
+        <w:t>. 133 da Constituição Federal.</w:t>
       </w:r>
     </w:p>
     <w:p>
@@ -2411,7 +2560,15 @@
         <w:t>CLÁUSULA TERCEIRA - DAS HIERARQUIAS JUDICIÁRIAS</w:t>
       </w:r>
       <w:r>
-        <w:t xml:space="preserve">: Fica estabelecido que os honorários contratados cobrem os serviços advocatícios prestados em qualquer instância, correndo todas as despesas processuais, inclusive passagens, estadias e alimentação da </w:t>
+        <w:t xml:space="preserve">: Fica estabelecido que os honorários contratados cobrem os serviços </w:t>
+      </w:r>
+      <w:proofErr w:type="spellStart"/>
+      <w:r>
+        <w:t>advocatícios</w:t>
+      </w:r>
+      <w:proofErr w:type="spellEnd"/>
+      <w:r>
+        <w:t xml:space="preserve"> prestados em qualquer instância, correndo todas as despesas processuais, inclusive passagens, estadias e alimentação da </w:t>
       </w:r>
       <w:r>
         <w:rPr>
@@ -2573,8 +2730,13 @@
         </w:rPr>
         <w:t xml:space="preserve"> </w:t>
       </w:r>
-      <w:r>
-        <w:t xml:space="preserve">pix, depósitos, transferências bancárias entre outras formas existentes, e na hipótese de parcelamento por meio de boleto bancário o </w:t>
+      <w:proofErr w:type="spellStart"/>
+      <w:r>
+        <w:t>pix</w:t>
+      </w:r>
+      <w:proofErr w:type="spellEnd"/>
+      <w:r>
+        <w:t xml:space="preserve">, depósitos, transferências bancárias entre outras formas existentes, e na hipótese de parcelamento por meio de boleto bancário o </w:t>
       </w:r>
       <w:r>
         <w:rPr>
@@ -2594,7 +2756,15 @@
         <w:t xml:space="preserve">CONTRATANTE </w:t>
       </w:r>
       <w:r>
-        <w:t xml:space="preserve">autoriza desde ja desconto das parcelas futuras caso haja, nos valores retroativos recebidos por meio de RPV e </w:t>
+        <w:t xml:space="preserve">autoriza desde </w:t>
+      </w:r>
+      <w:proofErr w:type="spellStart"/>
+      <w:r>
+        <w:t>ja</w:t>
+      </w:r>
+      <w:proofErr w:type="spellEnd"/>
+      <w:r>
+        <w:t xml:space="preserve"> desconto das parcelas futuras caso haja, nos valores retroativos recebidos por meio de RPV e </w:t>
       </w:r>
       <w:r>
         <w:rPr>
@@ -2716,6 +2886,7 @@
         </w:rPr>
         <w:t xml:space="preserve"> </w:t>
       </w:r>
+      <w:proofErr w:type="gramStart"/>
       <w:r>
         <w:t>os</w:t>
       </w:r>
@@ -2728,14 +2899,20 @@
       <w:r>
         <w:t>honorário</w:t>
       </w:r>
-      <w:r>
-        <w:rPr>
-          <w:spacing w:val="40"/>
-        </w:rPr>
-        <w:t xml:space="preserve"> </w:t>
-      </w:r>
-      <w:r>
-        <w:t>advocatícios avençados</w:t>
+      <w:proofErr w:type="gramEnd"/>
+      <w:r>
+        <w:rPr>
+          <w:spacing w:val="40"/>
+        </w:rPr>
+        <w:t xml:space="preserve"> </w:t>
+      </w:r>
+      <w:proofErr w:type="spellStart"/>
+      <w:r>
+        <w:t>advocatícios</w:t>
+      </w:r>
+      <w:proofErr w:type="spellEnd"/>
+      <w:r>
+        <w:t xml:space="preserve"> avençados</w:t>
       </w:r>
       <w:r>
         <w:rPr>
@@ -3704,7 +3881,15 @@
         <w:ind w:left="141" w:right="18"/>
       </w:pPr>
       <w:r>
-        <w:t>deverá manter-se atualizado do andamento dos serviços através do número oficial através de whatsapp 69 99604-1234, o CONTRATADO</w:t>
+        <w:t xml:space="preserve">deverá manter-se atualizado do andamento dos serviços através do número oficial através de </w:t>
+      </w:r>
+      <w:proofErr w:type="spellStart"/>
+      <w:r>
+        <w:t>whatsapp</w:t>
+      </w:r>
+      <w:proofErr w:type="spellEnd"/>
+      <w:r>
+        <w:t xml:space="preserve"> 69 99604-1234, o CONTRATADO</w:t>
       </w:r>
       <w:r>
         <w:rPr>
@@ -3866,11 +4051,19 @@
         </w:rPr>
         <w:t xml:space="preserve"> </w:t>
       </w:r>
-      <w:r>
-        <w:rPr>
-          <w:w w:val="105"/>
-        </w:rPr>
-        <w:t>Junior OAB 11700</w:t>
+      <w:proofErr w:type="spellStart"/>
+      <w:r>
+        <w:rPr>
+          <w:w w:val="105"/>
+        </w:rPr>
+        <w:t>Junior</w:t>
+      </w:r>
+      <w:proofErr w:type="spellEnd"/>
+      <w:r>
+        <w:rPr>
+          <w:w w:val="105"/>
+        </w:rPr>
+        <w:t xml:space="preserve"> OAB 11700</w:t>
       </w:r>
     </w:p>
     <w:p>

</xml_diff>